<commit_message>
Sync product spec with Home feed + Discover redesign
Update the product-vision doc (PDF + DOCX) to reflect the shipped UX:
- A6.A: Discover browse page (role chips, trending, new releases, people to follow)
- A6.D: "people you may know" suggestions
- A6.E: personalized network feed on Home (ranked, extended-network tier)
- S4: feed lives on Home; extended-network + suggestions
- S9: browse on Discover

Co-Authored-By: Claude Opus 4.8 <noreply@anthropic.com>
</commit_message>
<xml_diff>
--- a/docs/FilmIN-Product-Spec.docx
+++ b/docs/FilmIN-Product-Spec.docx
@@ -2420,7 +2420,7 @@
           <w:color w:val="1F2733"/>
           <w:sz w:val="19"/>
         </w:rPr>
-        <w:t xml:space="preserve"> — title pages (poster, year, synopsis), cast/crew, title search, trending rows.</w:t>
+        <w:t xml:space="preserve"> — title pages (poster, year, synopsis), cast/crew, title search, trending rows, and a Discover browse page (role chips, trending, new releases, people to follow).</w:t>
       </w:r>
     </w:p>
     <w:p>
@@ -2483,7 +2483,7 @@
           <w:color w:val="1F2733"/>
           <w:sz w:val="19"/>
         </w:rPr>
-        <w:t xml:space="preserve"> — follow, worked-with (derived from shared titles). [Later] mutual connections, endorsements, 'open to work.'</w:t>
+        <w:t xml:space="preserve"> — follow, worked-with (derived from shared titles), and 'people you may know' suggestions. [Later] mutual connections, endorsements, 'open to work.'</w:t>
       </w:r>
     </w:p>
     <w:p>
@@ -2504,7 +2504,7 @@
           <w:color w:val="1F2733"/>
           <w:sz w:val="19"/>
         </w:rPr>
-        <w:t xml:space="preserve"> — activity feed, posts/updates, likes. [Later] comments.</w:t>
+        <w:t xml:space="preserve"> — a personalized network feed on Home (posts + worked-with activity from your network, ranked by recency and proximity, with an extended-network tier), posts/updates, likes. [Later] comments.</w:t>
       </w:r>
     </w:p>
     <w:p>
@@ -2924,7 +2924,7 @@
           <w:color w:val="1F2733"/>
           <w:sz w:val="19"/>
         </w:rPr>
-        <w:t>Sam marks 'open to work' and posts a wrap announcement; Noor (following Sam) sees it in her feed and connects. Value: the network creates work.</w:t>
+        <w:t>Sam marks 'open to work' and posts a wrap announcement; Noor (in Sam's network) sees it on her Home feed and connects. Posts from friends-of-friends surface in an extended-network tier, and 'people you may know' suggests collaborators. Value: the network creates work.</w:t>
       </w:r>
     </w:p>
     <w:p>
@@ -3054,7 +3054,7 @@
           <w:color w:val="1F2733"/>
           <w:sz w:val="19"/>
         </w:rPr>
-        <w:t>Follows talent and explores who they've worked with via shared titles.</w:t>
+        <w:t>Browses people on Discover, follows talent, and explores who they've worked with via shared titles.</w:t>
       </w:r>
     </w:p>
     <w:p>

</xml_diff>